<commit_message>
Update Forms Word handbook
</commit_message>
<xml_diff>
--- a/docs/FORMS.docx
+++ b/docs/FORMS.docx
@@ -2614,7 +2614,23 @@
           <w:b w:val="0"/>
           <w:i w:val="0"/>
         </w:rPr>
-        <w:t xml:space="preserve"> with an overlay coordinate convention; the mapping is produced by a server-side extract-from-AcroForm / vector pipeline. (See the project's forms-migration and prefill-plan notes for the full mapping pipeline and per-form status — all 45 forms have been migrated.)</w:t>
+        <w:t xml:space="preserve"> with an overlay coordinate convention; the mapping is produced by a server-side extract-from-AcroForm / vector pipeline. (See the project's forms-migration and prefill-plan notes for the full mapping pipeline and per-form status — 135 of Ontario's 140 published forms are catalogued, plus the BC set; the Ontario build tooling is in </w:t>
+      </w:r>
+      <w:r>
+        <w:rPr>
+          <w:rFonts w:ascii="Consolas" w:hAnsi="Consolas"/>
+          <w:b w:val="0"/>
+          <w:i w:val="0"/>
+          <w:sz w:val="19"/>
+        </w:rPr>
+        <w:t>auth-server/tools/on-forms/</w:t>
+      </w:r>
+      <w:r>
+        <w:rPr>
+          <w:b w:val="0"/>
+          <w:i w:val="0"/>
+        </w:rPr>
+        <w:t>.)</w:t>
       </w:r>
     </w:p>
     <w:p>
@@ -3349,6 +3365,73 @@
           <w:b/>
           <w:i w:val="0"/>
         </w:rPr>
+        <w:t>Missing BC signature captions are a flattening issue, not an overlay issue.</w:t>
+      </w:r>
+      <w:r>
+        <w:rPr>
+          <w:b w:val="0"/>
+          <w:i w:val="0"/>
+        </w:rPr>
+        <w:t xml:space="preserve"> An unpatched pdf.js XFA render drops </w:t>
+      </w:r>
+      <w:r>
+        <w:rPr>
+          <w:rFonts w:ascii="Consolas" w:hAnsi="Consolas"/>
+          <w:b w:val="0"/>
+          <w:i w:val="0"/>
+          <w:sz w:val="19"/>
+        </w:rPr>
+        <w:t>&lt;signature&gt;</w:t>
+      </w:r>
+      <w:r>
+        <w:rPr>
+          <w:b w:val="0"/>
+          <w:i w:val="0"/>
+        </w:rPr>
+        <w:t xml:space="preserve"> widgets and captions such as "Signature of" or "Judge / Associate Judge / Registrar". The BC pipeline's </w:t>
+      </w:r>
+      <w:r>
+        <w:rPr>
+          <w:rFonts w:ascii="Consolas" w:hAnsi="Consolas"/>
+          <w:b w:val="0"/>
+          <w:i w:val="0"/>
+          <w:sz w:val="19"/>
+        </w:rPr>
+        <w:t>xfa/patch_pdfjs_signature.mjs</w:t>
+      </w:r>
+      <w:r>
+        <w:rPr>
+          <w:b w:val="0"/>
+          <w:i w:val="0"/>
+        </w:rPr>
+        <w:t xml:space="preserve"> preserves a non-editable signing area; its rule must remain above a </w:t>
+      </w:r>
+      <w:r>
+        <w:rPr>
+          <w:rFonts w:ascii="Consolas" w:hAnsi="Consolas"/>
+          <w:b w:val="0"/>
+          <w:i w:val="0"/>
+          <w:sz w:val="19"/>
+        </w:rPr>
+        <w:t>placement="bottom"</w:t>
+      </w:r>
+      <w:r>
+        <w:rPr>
+          <w:b w:val="0"/>
+          <w:i w:val="0"/>
+        </w:rPr>
+        <w:t xml:space="preserve"> caption. Do not add an editable field or patch the React viewer to compensate.</w:t>
+      </w:r>
+    </w:p>
+    <w:p>
+      <w:pPr>
+        <w:pStyle w:val="ListBullet"/>
+      </w:pPr>
+      <w:r>
+        <w:rPr>
+          <w:b/>
+          <w:i w:val="0"/>
+        </w:rPr>
         <w:t>A form must have a folder</w:t>
       </w:r>
       <w:r>

</xml_diff>